<commit_message>
ci: add Trivy scan pipeline stage and update Dockerfiles to use private registry and configured npm proxy
</commit_message>
<xml_diff>
--- a/projet brouiilon.docx
+++ b/projet brouiilon.docx
@@ -212,7 +212,7 @@
         <w:rPr>
           <w:noProof/>
         </w:rPr>
-        <w:pict w14:anchorId="0D8B9147">
+        <w:pict w14:anchorId="0742673E">
           <v:rect id="_x0000_i1025" alt="" style="width:468pt;height:.05pt;mso-width-percent:0;mso-height-percent:0;mso-width-percent:0;mso-height-percent:0" o:hralign="center" o:hrstd="t" o:hr="t" fillcolor="#a0a0a0" stroked="f"/>
         </w:pict>
       </w:r>
@@ -7799,6 +7799,146 @@
           <w14:ligatures w14:val="none"/>
         </w:rPr>
       </w:pPr>
+      <w:r>
+        <w:rPr>
+          <w:rFonts w:eastAsia="Times New Roman" w:cs="Times New Roman"/>
+          <w:color w:val="000000"/>
+          <w:kern w:val="0"/>
+          <w14:ligatures w14:val="none"/>
+        </w:rPr>
+        <w:t>snyk is op</w:t>
+      </w:r>
+    </w:p>
+    <w:p>
+      <w:pPr>
+        <w:spacing w:before="240" w:after="240" w:line="240" w:lineRule="auto"/>
+        <w:rPr>
+          <w:rFonts w:eastAsia="Times New Roman" w:cs="Times New Roman"/>
+          <w:color w:val="000000"/>
+          <w:kern w:val="0"/>
+          <w14:ligatures w14:val="none"/>
+        </w:rPr>
+      </w:pPr>
+      <w:hyperlink r:id="rId17" w:history="1">
+        <w:r>
+          <w:rPr>
+            <w:rStyle w:val="Hyperlink"/>
+            <w:rFonts w:eastAsia="Times New Roman" w:cs="Times New Roman"/>
+            <w:kern w:val="0"/>
+            <w14:ligatures w14:val="none"/>
+          </w:rPr>
+          <w:t>https://app.snyk.io/org/yassine0010/projects?groupBy=targets&amp;before&amp;after&amp;searchQuery=&amp;sortBy=highest+severity&amp;filters[Show]=&amp;filters[Integrations]=&amp;filters[CollectionIds]=</w:t>
+        </w:r>
+      </w:hyperlink>
+    </w:p>
+    <w:p>
+      <w:pPr>
+        <w:spacing w:before="240" w:after="240" w:line="240" w:lineRule="auto"/>
+        <w:rPr>
+          <w:rFonts w:eastAsia="Times New Roman" w:cs="Times New Roman"/>
+          <w:color w:val="000000"/>
+          <w:kern w:val="0"/>
+          <w14:ligatures w14:val="none"/>
+        </w:rPr>
+      </w:pPr>
+      <w:r>
+        <w:rPr>
+          <w:rFonts w:eastAsia="Times New Roman" w:cs="Times New Roman"/>
+          <w:color w:val="000000"/>
+          <w:kern w:val="0"/>
+          <w14:ligatures w14:val="none"/>
+        </w:rPr>
+        <w:t>defectdojo at port 8080</w:t>
+      </w:r>
+    </w:p>
+    <w:p>
+      <w:pPr>
+        <w:spacing w:before="240" w:after="240" w:line="240" w:lineRule="auto"/>
+        <w:rPr>
+          <w:rFonts w:eastAsia="Times New Roman" w:cs="Times New Roman"/>
+          <w:color w:val="000000"/>
+          <w:kern w:val="0"/>
+          <w14:ligatures w14:val="none"/>
+        </w:rPr>
+      </w:pPr>
+      <w:r>
+        <w:rPr>
+          <w:rFonts w:eastAsia="Times New Roman" w:cs="Times New Roman"/>
+          <w:color w:val="000000"/>
+          <w:kern w:val="0"/>
+          <w14:ligatures w14:val="none"/>
+        </w:rPr>
+        <w:t>sonarqube at 9000</w:t>
+      </w:r>
+    </w:p>
+    <w:p>
+      <w:pPr>
+        <w:spacing w:before="240" w:after="240" w:line="240" w:lineRule="auto"/>
+        <w:rPr>
+          <w:rFonts w:eastAsia="Times New Roman" w:cs="Times New Roman"/>
+          <w:color w:val="000000"/>
+          <w:kern w:val="0"/>
+          <w14:ligatures w14:val="none"/>
+        </w:rPr>
+      </w:pPr>
+      <w:r>
+        <w:rPr>
+          <w:rFonts w:eastAsia="Times New Roman" w:cs="Times New Roman"/>
+          <w:color w:val="000000"/>
+          <w:kern w:val="0"/>
+          <w14:ligatures w14:val="none"/>
+        </w:rPr>
+        <w:t>nexus 8081</w:t>
+      </w:r>
+      <w:r>
+        <w:rPr>
+          <w:rFonts w:eastAsia="Times New Roman" w:cs="Times New Roman"/>
+          <w:color w:val="000000"/>
+          <w:kern w:val="0"/>
+          <w14:ligatures w14:val="none"/>
+        </w:rPr>
+        <w:t xml:space="preserve"> </w:t>
+      </w:r>
+      <w:r>
+        <w:rPr>
+          <w:rFonts w:eastAsia="Times New Roman" w:cs="Times New Roman"/>
+          <w:color w:val="000000"/>
+          <w:kern w:val="0"/>
+          <w14:ligatures w14:val="none"/>
+        </w:rPr>
+        <w:t>bujjed-hyJvas-wynpy6</w:t>
+      </w:r>
+    </w:p>
+    <w:p>
+      <w:pPr>
+        <w:spacing w:before="240" w:after="240" w:line="240" w:lineRule="auto"/>
+        <w:rPr>
+          <w:rFonts w:eastAsia="Times New Roman" w:cs="Times New Roman"/>
+          <w:color w:val="000000"/>
+          <w:kern w:val="0"/>
+          <w14:ligatures w14:val="none"/>
+        </w:rPr>
+      </w:pPr>
+    </w:p>
+    <w:p>
+      <w:pPr>
+        <w:spacing w:before="240" w:after="240" w:line="240" w:lineRule="auto"/>
+        <w:rPr>
+          <w:rFonts w:eastAsia="Times New Roman" w:cs="Times New Roman"/>
+          <w:color w:val="000000"/>
+          <w:kern w:val="0"/>
+          <w14:ligatures w14:val="none"/>
+        </w:rPr>
+      </w:pPr>
+      <w:r>
+        <w:rPr>
+          <w:rFonts w:eastAsia="Times New Roman" w:cs="Times New Roman"/>
+          <w:color w:val="000000"/>
+          <w:kern w:val="0"/>
+          <w14:ligatures w14:val="none"/>
+        </w:rPr>
+        <w:t>please don’t forget to update the cv linkedin with new tools</w:t>
+      </w:r>
     </w:p>
     <w:p>
       <w:pPr>
@@ -7833,7 +7973,7 @@
                     <pic:cNvPicPr/>
                   </pic:nvPicPr>
                   <pic:blipFill>
-                    <a:blip r:embed="rId17"/>
+                    <a:blip r:embed="rId18"/>
                     <a:stretch>
                       <a:fillRect/>
                     </a:stretch>

</xml_diff>